<commit_message>
Publish analysis Word download and revised displays
</commit_message>
<xml_diff>
--- a/output/manuscript/Table3.docx
+++ b/output/manuscript/Table3.docx
@@ -26,10 +26,10 @@
         <w:tblLayout w:type="fixed"/>
       </w:tblPr>
       <w:tblGrid>
-        <w:gridCol w:w="3817"/>
-        <w:gridCol w:w="1587"/>
-        <w:gridCol w:w="2098"/>
-        <w:gridCol w:w="2362"/>
+        <w:gridCol w:w="3794"/>
+        <w:gridCol w:w="1518"/>
+        <w:gridCol w:w="2181"/>
+        <w:gridCol w:w="2371"/>
       </w:tblGrid>
       <w:tr>
         <w:trPr>
@@ -38,7 +38,7 @@
         </w:trPr>
         <w:tc>
           <w:tcPr>
-            <w:tcW w:type="dxa" w:w="3817"/>
+            <w:tcW w:type="dxa" w:w="3794"/>
             <w:tcMar>
               <w:top w:type="dxa" w:w="35"/>
               <w:bottom w:type="dxa" w:w="35"/>
@@ -69,7 +69,7 @@
         </w:tc>
         <w:tc>
           <w:tcPr>
-            <w:tcW w:type="dxa" w:w="1587"/>
+            <w:tcW w:type="dxa" w:w="1518"/>
             <w:tcMar>
               <w:top w:type="dxa" w:w="35"/>
               <w:bottom w:type="dxa" w:w="35"/>
@@ -100,7 +100,7 @@
         </w:tc>
         <w:tc>
           <w:tcPr>
-            <w:tcW w:type="dxa" w:w="2098"/>
+            <w:tcW w:type="dxa" w:w="2181"/>
             <w:tcMar>
               <w:top w:type="dxa" w:w="35"/>
               <w:bottom w:type="dxa" w:w="35"/>
@@ -131,7 +131,7 @@
         </w:tc>
         <w:tc>
           <w:tcPr>
-            <w:tcW w:type="dxa" w:w="2362"/>
+            <w:tcW w:type="dxa" w:w="2371"/>
             <w:tcMar>
               <w:top w:type="dxa" w:w="35"/>
               <w:bottom w:type="dxa" w:w="35"/>
@@ -204,7 +204,7 @@
         </w:trPr>
         <w:tc>
           <w:tcPr>
-            <w:tcW w:type="dxa" w:w="3817"/>
+            <w:tcW w:type="dxa" w:w="3794"/>
             <w:tcMar>
               <w:top w:type="dxa" w:w="35"/>
               <w:bottom w:type="dxa" w:w="35"/>
@@ -234,7 +234,7 @@
         </w:tc>
         <w:tc>
           <w:tcPr>
-            <w:tcW w:type="dxa" w:w="1587"/>
+            <w:tcW w:type="dxa" w:w="1518"/>
             <w:tcMar>
               <w:top w:type="dxa" w:w="35"/>
               <w:bottom w:type="dxa" w:w="35"/>
@@ -264,7 +264,7 @@
         </w:tc>
         <w:tc>
           <w:tcPr>
-            <w:tcW w:type="dxa" w:w="2098"/>
+            <w:tcW w:type="dxa" w:w="2181"/>
             <w:tcMar>
               <w:top w:type="dxa" w:w="35"/>
               <w:bottom w:type="dxa" w:w="35"/>
@@ -294,7 +294,7 @@
         </w:tc>
         <w:tc>
           <w:tcPr>
-            <w:tcW w:type="dxa" w:w="2362"/>
+            <w:tcW w:type="dxa" w:w="2371"/>
             <w:tcMar>
               <w:top w:type="dxa" w:w="35"/>
               <w:bottom w:type="dxa" w:w="35"/>
@@ -329,7 +329,7 @@
         </w:trPr>
         <w:tc>
           <w:tcPr>
-            <w:tcW w:type="dxa" w:w="3817"/>
+            <w:tcW w:type="dxa" w:w="3794"/>
             <w:tcMar>
               <w:top w:type="dxa" w:w="35"/>
               <w:bottom w:type="dxa" w:w="35"/>
@@ -359,7 +359,7 @@
         </w:tc>
         <w:tc>
           <w:tcPr>
-            <w:tcW w:type="dxa" w:w="1587"/>
+            <w:tcW w:type="dxa" w:w="1518"/>
             <w:tcMar>
               <w:top w:type="dxa" w:w="35"/>
               <w:bottom w:type="dxa" w:w="35"/>
@@ -389,7 +389,7 @@
         </w:tc>
         <w:tc>
           <w:tcPr>
-            <w:tcW w:type="dxa" w:w="2098"/>
+            <w:tcW w:type="dxa" w:w="2181"/>
             <w:tcMar>
               <w:top w:type="dxa" w:w="35"/>
               <w:bottom w:type="dxa" w:w="35"/>
@@ -419,7 +419,7 @@
         </w:tc>
         <w:tc>
           <w:tcPr>
-            <w:tcW w:type="dxa" w:w="2362"/>
+            <w:tcW w:type="dxa" w:w="2371"/>
             <w:tcMar>
               <w:top w:type="dxa" w:w="35"/>
               <w:bottom w:type="dxa" w:w="35"/>
@@ -454,7 +454,7 @@
         </w:trPr>
         <w:tc>
           <w:tcPr>
-            <w:tcW w:type="dxa" w:w="3817"/>
+            <w:tcW w:type="dxa" w:w="3794"/>
             <w:tcMar>
               <w:top w:type="dxa" w:w="35"/>
               <w:bottom w:type="dxa" w:w="35"/>
@@ -484,7 +484,7 @@
         </w:tc>
         <w:tc>
           <w:tcPr>
-            <w:tcW w:type="dxa" w:w="1587"/>
+            <w:tcW w:type="dxa" w:w="1518"/>
             <w:tcMar>
               <w:top w:type="dxa" w:w="35"/>
               <w:bottom w:type="dxa" w:w="35"/>
@@ -514,7 +514,7 @@
         </w:tc>
         <w:tc>
           <w:tcPr>
-            <w:tcW w:type="dxa" w:w="2098"/>
+            <w:tcW w:type="dxa" w:w="2181"/>
             <w:tcMar>
               <w:top w:type="dxa" w:w="35"/>
               <w:bottom w:type="dxa" w:w="35"/>
@@ -544,7 +544,7 @@
         </w:tc>
         <w:tc>
           <w:tcPr>
-            <w:tcW w:type="dxa" w:w="2362"/>
+            <w:tcW w:type="dxa" w:w="2371"/>
             <w:tcMar>
               <w:top w:type="dxa" w:w="35"/>
               <w:bottom w:type="dxa" w:w="35"/>
@@ -579,7 +579,7 @@
         </w:trPr>
         <w:tc>
           <w:tcPr>
-            <w:tcW w:type="dxa" w:w="3817"/>
+            <w:tcW w:type="dxa" w:w="3794"/>
             <w:tcMar>
               <w:top w:type="dxa" w:w="35"/>
               <w:bottom w:type="dxa" w:w="35"/>
@@ -609,7 +609,7 @@
         </w:tc>
         <w:tc>
           <w:tcPr>
-            <w:tcW w:type="dxa" w:w="1587"/>
+            <w:tcW w:type="dxa" w:w="1518"/>
             <w:tcMar>
               <w:top w:type="dxa" w:w="35"/>
               <w:bottom w:type="dxa" w:w="35"/>
@@ -639,7 +639,7 @@
         </w:tc>
         <w:tc>
           <w:tcPr>
-            <w:tcW w:type="dxa" w:w="2098"/>
+            <w:tcW w:type="dxa" w:w="2181"/>
             <w:tcMar>
               <w:top w:type="dxa" w:w="35"/>
               <w:bottom w:type="dxa" w:w="35"/>
@@ -669,7 +669,7 @@
         </w:tc>
         <w:tc>
           <w:tcPr>
-            <w:tcW w:type="dxa" w:w="2362"/>
+            <w:tcW w:type="dxa" w:w="2371"/>
             <w:tcMar>
               <w:top w:type="dxa" w:w="35"/>
               <w:bottom w:type="dxa" w:w="35"/>
@@ -730,7 +730,7 @@
                 <w:sz w:val="20"/>
                 <w:b/>
               </w:rPr>
-              <w:t xml:space="default">B. Structural record checks</w:t>
+              <w:t xml:space="default">B. Computational resources</w:t>
             </w:r>
           </w:p>
         </w:tc>
@@ -741,7 +741,7 @@
         </w:trPr>
         <w:tc>
           <w:tcPr>
-            <w:tcW w:type="dxa" w:w="3817"/>
+            <w:tcW w:type="dxa" w:w="3794"/>
             <w:tcMar>
               <w:top w:type="dxa" w:w="35"/>
               <w:bottom w:type="dxa" w:w="35"/>
@@ -765,13 +765,13 @@
                 <w:rFonts w:ascii="Arial" w:hAnsi="Arial"/>
                 <w:sz w:val="20"/>
               </w:rPr>
-              <w:t xml:space="default">Answers citing ≥1 passage or image</w:t>
-            </w:r>
-          </w:p>
-        </w:tc>
-        <w:tc>
-          <w:tcPr>
-            <w:tcW w:type="dxa" w:w="1587"/>
+              <w:t xml:space="default">Runtime (minutes/trial), median (IQR)</w:t>
+            </w:r>
+          </w:p>
+        </w:tc>
+        <w:tc>
+          <w:tcPr>
+            <w:tcW w:type="dxa" w:w="1518"/>
             <w:tcMar>
               <w:top w:type="dxa" w:w="35"/>
               <w:bottom w:type="dxa" w:w="35"/>
@@ -795,13 +795,13 @@
                 <w:rFonts w:ascii="Arial" w:hAnsi="Arial"/>
                 <w:sz w:val="20"/>
               </w:rPr>
-              <w:t xml:space="default">1,538/1,538 (100.0%)</w:t>
-            </w:r>
-          </w:p>
-        </w:tc>
-        <w:tc>
-          <w:tcPr>
-            <w:tcW w:type="dxa" w:w="2098"/>
+              <w:t xml:space="default">7.6 (6.1–10.5)</w:t>
+            </w:r>
+          </w:p>
+        </w:tc>
+        <w:tc>
+          <w:tcPr>
+            <w:tcW w:type="dxa" w:w="2181"/>
             <w:tcMar>
               <w:top w:type="dxa" w:w="35"/>
               <w:bottom w:type="dxa" w:w="35"/>
@@ -825,13 +825,13 @@
                 <w:rFonts w:ascii="Arial" w:hAnsi="Arial"/>
                 <w:sz w:val="20"/>
               </w:rPr>
-              <w:t xml:space="default">Not available</w:t>
-            </w:r>
-          </w:p>
-        </w:tc>
-        <w:tc>
-          <w:tcPr>
-            <w:tcW w:type="dxa" w:w="2362"/>
+              <w:t xml:space="default">0.5 (0.4–0.5)</w:t>
+            </w:r>
+          </w:p>
+        </w:tc>
+        <w:tc>
+          <w:tcPr>
+            <w:tcW w:type="dxa" w:w="2371"/>
             <w:tcMar>
               <w:top w:type="dxa" w:w="35"/>
               <w:bottom w:type="dxa" w:w="35"/>
@@ -855,7 +855,7 @@
                 <w:rFonts w:ascii="Arial" w:hAnsi="Arial"/>
                 <w:sz w:val="20"/>
               </w:rPr>
-              <w:t xml:space="default">—</w:t>
+              <w:t xml:space="default">11.0 (8.4–14.1)</w:t>
             </w:r>
           </w:p>
         </w:tc>
@@ -866,7 +866,7 @@
         </w:trPr>
         <w:tc>
           <w:tcPr>
-            <w:tcW w:type="dxa" w:w="3817"/>
+            <w:tcW w:type="dxa" w:w="3794"/>
             <w:tcMar>
               <w:top w:type="dxa" w:w="35"/>
               <w:bottom w:type="dxa" w:w="35"/>
@@ -890,13 +890,13 @@
                 <w:rFonts w:ascii="Arial" w:hAnsi="Arial"/>
                 <w:sz w:val="20"/>
               </w:rPr>
-              <w:t xml:space="default">Quoted text linked to its source</w:t>
-            </w:r>
-          </w:p>
-        </w:tc>
-        <w:tc>
-          <w:tcPr>
-            <w:tcW w:type="dxa" w:w="1587"/>
+              <w:t xml:space="default">API list-price equivalent (US$/trial), median (IQR)</w:t>
+            </w:r>
+          </w:p>
+        </w:tc>
+        <w:tc>
+          <w:tcPr>
+            <w:tcW w:type="dxa" w:w="1518"/>
             <w:tcMar>
               <w:top w:type="dxa" w:w="35"/>
               <w:bottom w:type="dxa" w:w="35"/>
@@ -920,13 +920,13 @@
                 <w:rFonts w:ascii="Arial" w:hAnsi="Arial"/>
                 <w:sz w:val="20"/>
               </w:rPr>
-              <w:t xml:space="default">1,407/1,407 (100.0%)</w:t>
-            </w:r>
-          </w:p>
-        </w:tc>
-        <w:tc>
-          <w:tcPr>
-            <w:tcW w:type="dxa" w:w="2098"/>
+              <w:t xml:space="default">3.78 (3.46–4.10)</w:t>
+            </w:r>
+          </w:p>
+        </w:tc>
+        <w:tc>
+          <w:tcPr>
+            <w:tcW w:type="dxa" w:w="2181"/>
             <w:tcMar>
               <w:top w:type="dxa" w:w="35"/>
               <w:bottom w:type="dxa" w:w="35"/>
@@ -950,13 +950,13 @@
                 <w:rFonts w:ascii="Arial" w:hAnsi="Arial"/>
                 <w:sz w:val="20"/>
               </w:rPr>
-              <w:t xml:space="default">Not available</w:t>
-            </w:r>
-          </w:p>
-        </w:tc>
-        <w:tc>
-          <w:tcPr>
-            <w:tcW w:type="dxa" w:w="2362"/>
+              <w:t xml:space="default">0.09 (0.07–0.13)</w:t>
+            </w:r>
+          </w:p>
+        </w:tc>
+        <w:tc>
+          <w:tcPr>
+            <w:tcW w:type="dxa" w:w="2371"/>
             <w:tcMar>
               <w:top w:type="dxa" w:w="35"/>
               <w:bottom w:type="dxa" w:w="35"/>
@@ -980,7 +980,7 @@
                 <w:rFonts w:ascii="Arial" w:hAnsi="Arial"/>
                 <w:sz w:val="20"/>
               </w:rPr>
-              <w:t xml:space="default">—</w:t>
+              <w:t xml:space="default">3.68 (3.61–3.75)</w:t>
             </w:r>
           </w:p>
         </w:tc>
@@ -991,256 +991,6 @@
         </w:trPr>
         <w:tc>
           <w:tcPr>
-            <w:tcW w:type="dxa" w:w="3817"/>
-            <w:tcMar>
-              <w:top w:type="dxa" w:w="35"/>
-              <w:bottom w:type="dxa" w:w="35"/>
-              <w:start w:type="dxa" w:w="70"/>
-              <w:end w:type="dxa" w:w="70"/>
-            </w:tcMar>
-            <w:tcBorders>
-              <w:top w:val="nil" w:sz="0" w:color="666666"/>
-              <w:bottom w:val="nil" w:sz="0" w:color="666666"/>
-              <w:start w:val="nil" w:sz="0" w:color="666666"/>
-              <w:end w:val="nil" w:sz="0" w:color="666666"/>
-            </w:tcBorders>
-          </w:tcPr>
-          <w:p>
-            <w:pPr>
-              <w:spacing w:before="0" w:after="60"/>
-              <w:jc w:val="start"/>
-            </w:pPr>
-            <w:r>
-              <w:rPr>
-                <w:rFonts w:ascii="Arial" w:hAnsi="Arial"/>
-                <w:sz w:val="20"/>
-              </w:rPr>
-              <w:t xml:space="default">Image regions linked to their page</w:t>
-            </w:r>
-          </w:p>
-        </w:tc>
-        <w:tc>
-          <w:tcPr>
-            <w:tcW w:type="dxa" w:w="1587"/>
-            <w:tcMar>
-              <w:top w:type="dxa" w:w="35"/>
-              <w:bottom w:type="dxa" w:w="35"/>
-              <w:start w:type="dxa" w:w="70"/>
-              <w:end w:type="dxa" w:w="70"/>
-            </w:tcMar>
-            <w:tcBorders>
-              <w:top w:val="nil" w:sz="0" w:color="666666"/>
-              <w:bottom w:val="nil" w:sz="0" w:color="666666"/>
-              <w:start w:val="nil" w:sz="0" w:color="666666"/>
-              <w:end w:val="nil" w:sz="0" w:color="666666"/>
-            </w:tcBorders>
-          </w:tcPr>
-          <w:p>
-            <w:pPr>
-              <w:spacing w:before="0" w:after="60"/>
-              <w:jc w:val="end"/>
-            </w:pPr>
-            <w:r>
-              <w:rPr>
-                <w:rFonts w:ascii="Arial" w:hAnsi="Arial"/>
-                <w:sz w:val="20"/>
-              </w:rPr>
-              <w:t xml:space="default">14/14 (100%)</w:t>
-            </w:r>
-          </w:p>
-        </w:tc>
-        <w:tc>
-          <w:tcPr>
-            <w:tcW w:type="dxa" w:w="2098"/>
-            <w:tcMar>
-              <w:top w:type="dxa" w:w="35"/>
-              <w:bottom w:type="dxa" w:w="35"/>
-              <w:start w:type="dxa" w:w="70"/>
-              <w:end w:type="dxa" w:w="70"/>
-            </w:tcMar>
-            <w:tcBorders>
-              <w:top w:val="nil" w:sz="0" w:color="666666"/>
-              <w:bottom w:val="nil" w:sz="0" w:color="666666"/>
-              <w:start w:val="nil" w:sz="0" w:color="666666"/>
-              <w:end w:val="nil" w:sz="0" w:color="666666"/>
-            </w:tcBorders>
-          </w:tcPr>
-          <w:p>
-            <w:pPr>
-              <w:spacing w:before="0" w:after="60"/>
-              <w:jc w:val="end"/>
-            </w:pPr>
-            <w:r>
-              <w:rPr>
-                <w:rFonts w:ascii="Arial" w:hAnsi="Arial"/>
-                <w:sz w:val="20"/>
-              </w:rPr>
-              <w:t xml:space="default">Not available</w:t>
-            </w:r>
-          </w:p>
-        </w:tc>
-        <w:tc>
-          <w:tcPr>
-            <w:tcW w:type="dxa" w:w="2362"/>
-            <w:tcMar>
-              <w:top w:type="dxa" w:w="35"/>
-              <w:bottom w:type="dxa" w:w="35"/>
-              <w:start w:type="dxa" w:w="70"/>
-              <w:end w:type="dxa" w:w="70"/>
-            </w:tcMar>
-            <w:tcBorders>
-              <w:top w:val="nil" w:sz="0" w:color="666666"/>
-              <w:bottom w:val="nil" w:sz="0" w:color="666666"/>
-              <w:start w:val="nil" w:sz="0" w:color="666666"/>
-              <w:end w:val="nil" w:sz="0" w:color="666666"/>
-            </w:tcBorders>
-          </w:tcPr>
-          <w:p>
-            <w:pPr>
-              <w:spacing w:before="0" w:after="60"/>
-              <w:jc w:val="end"/>
-            </w:pPr>
-            <w:r>
-              <w:rPr>
-                <w:rFonts w:ascii="Arial" w:hAnsi="Arial"/>
-                <w:sz w:val="20"/>
-              </w:rPr>
-              <w:t xml:space="default">—</w:t>
-            </w:r>
-          </w:p>
-        </w:tc>
-      </w:tr>
-      <w:tr>
-        <w:trPr>
-          <w:cantSplit/>
-        </w:trPr>
-        <w:tc>
-          <w:tcPr>
-            <w:tcW w:type="dxa" w:w="3817"/>
-            <w:tcMar>
-              <w:top w:type="dxa" w:w="35"/>
-              <w:bottom w:type="dxa" w:w="35"/>
-              <w:start w:type="dxa" w:w="70"/>
-              <w:end w:type="dxa" w:w="70"/>
-            </w:tcMar>
-            <w:tcBorders>
-              <w:top w:val="nil" w:sz="0" w:color="666666"/>
-              <w:bottom w:val="nil" w:sz="0" w:color="666666"/>
-              <w:start w:val="nil" w:sz="0" w:color="666666"/>
-              <w:end w:val="nil" w:sz="0" w:color="666666"/>
-            </w:tcBorders>
-          </w:tcPr>
-          <w:p>
-            <w:pPr>
-              <w:spacing w:before="0" w:after="60"/>
-              <w:jc w:val="start"/>
-            </w:pPr>
-            <w:r>
-              <w:rPr>
-                <w:rFonts w:ascii="Arial" w:hAnsi="Arial"/>
-                <w:sz w:val="20"/>
-              </w:rPr>
-              <w:t xml:space="default">Audit file passes the independent verifier</w:t>
-            </w:r>
-          </w:p>
-        </w:tc>
-        <w:tc>
-          <w:tcPr>
-            <w:tcW w:type="dxa" w:w="1587"/>
-            <w:tcMar>
-              <w:top w:type="dxa" w:w="35"/>
-              <w:bottom w:type="dxa" w:w="35"/>
-              <w:start w:type="dxa" w:w="70"/>
-              <w:end w:type="dxa" w:w="70"/>
-            </w:tcMar>
-            <w:tcBorders>
-              <w:top w:val="nil" w:sz="0" w:color="666666"/>
-              <w:bottom w:val="nil" w:sz="0" w:color="666666"/>
-              <w:start w:val="nil" w:sz="0" w:color="666666"/>
-              <w:end w:val="nil" w:sz="0" w:color="666666"/>
-            </w:tcBorders>
-          </w:tcPr>
-          <w:p>
-            <w:pPr>
-              <w:spacing w:before="0" w:after="60"/>
-              <w:jc w:val="end"/>
-            </w:pPr>
-            <w:r>
-              <w:rPr>
-                <w:rFonts w:ascii="Arial" w:hAnsi="Arial"/>
-                <w:sz w:val="20"/>
-              </w:rPr>
-              <w:t xml:space="default">102/102 (100.0%)</w:t>
-            </w:r>
-          </w:p>
-        </w:tc>
-        <w:tc>
-          <w:tcPr>
-            <w:tcW w:type="dxa" w:w="2098"/>
-            <w:tcMar>
-              <w:top w:type="dxa" w:w="35"/>
-              <w:bottom w:type="dxa" w:w="35"/>
-              <w:start w:type="dxa" w:w="70"/>
-              <w:end w:type="dxa" w:w="70"/>
-            </w:tcMar>
-            <w:tcBorders>
-              <w:top w:val="nil" w:sz="0" w:color="666666"/>
-              <w:bottom w:val="nil" w:sz="0" w:color="666666"/>
-              <w:start w:val="nil" w:sz="0" w:color="666666"/>
-              <w:end w:val="nil" w:sz="0" w:color="666666"/>
-            </w:tcBorders>
-          </w:tcPr>
-          <w:p>
-            <w:pPr>
-              <w:spacing w:before="0" w:after="60"/>
-              <w:jc w:val="end"/>
-            </w:pPr>
-            <w:r>
-              <w:rPr>
-                <w:rFonts w:ascii="Arial" w:hAnsi="Arial"/>
-                <w:sz w:val="20"/>
-              </w:rPr>
-              <w:t xml:space="default">Not available</w:t>
-            </w:r>
-          </w:p>
-        </w:tc>
-        <w:tc>
-          <w:tcPr>
-            <w:tcW w:type="dxa" w:w="2362"/>
-            <w:tcMar>
-              <w:top w:type="dxa" w:w="35"/>
-              <w:bottom w:type="dxa" w:w="35"/>
-              <w:start w:type="dxa" w:w="70"/>
-              <w:end w:type="dxa" w:w="70"/>
-            </w:tcMar>
-            <w:tcBorders>
-              <w:top w:val="nil" w:sz="0" w:color="666666"/>
-              <w:bottom w:val="nil" w:sz="0" w:color="666666"/>
-              <w:start w:val="nil" w:sz="0" w:color="666666"/>
-              <w:end w:val="nil" w:sz="0" w:color="666666"/>
-            </w:tcBorders>
-          </w:tcPr>
-          <w:p>
-            <w:pPr>
-              <w:spacing w:before="0" w:after="60"/>
-              <w:jc w:val="end"/>
-            </w:pPr>
-            <w:r>
-              <w:rPr>
-                <w:rFonts w:ascii="Arial" w:hAnsi="Arial"/>
-                <w:sz w:val="20"/>
-              </w:rPr>
-              <w:t xml:space="default">—</w:t>
-            </w:r>
-          </w:p>
-        </w:tc>
-      </w:tr>
-      <w:tr>
-        <w:trPr>
-          <w:cantSplit/>
-        </w:trPr>
-        <w:tc>
-          <w:tcPr>
             <w:gridSpan w:val="4"/>
             <w:tcW w:type="dxa" w:w="9864"/>
             <w:tcMar>
@@ -1250,42 +1000,6 @@
               <w:end w:type="dxa" w:w="70"/>
             </w:tcMar>
             <w:tcBorders>
-              <w:top w:val="single" w:sz="6" w:color="666666"/>
-              <w:bottom w:val="nil" w:sz="0" w:color="666666"/>
-              <w:start w:val="nil" w:sz="0" w:color="666666"/>
-              <w:end w:val="nil" w:sz="0" w:color="666666"/>
-            </w:tcBorders>
-            <w:shd w:fill="F4F4F4"/>
-          </w:tcPr>
-          <w:p>
-            <w:pPr>
-              <w:spacing w:before="0" w:after="60"/>
-            </w:pPr>
-            <w:r>
-              <w:rPr>
-                <w:rFonts w:ascii="Arial" w:hAnsi="Arial"/>
-                <w:sz w:val="20"/>
-                <w:b/>
-              </w:rPr>
-              <w:t xml:space="default">C. Computational resources</w:t>
-            </w:r>
-          </w:p>
-        </w:tc>
-      </w:tr>
-      <w:tr>
-        <w:trPr>
-          <w:cantSplit/>
-        </w:trPr>
-        <w:tc>
-          <w:tcPr>
-            <w:tcW w:type="dxa" w:w="3817"/>
-            <w:tcMar>
-              <w:top w:type="dxa" w:w="35"/>
-              <w:bottom w:type="dxa" w:w="35"/>
-              <w:start w:type="dxa" w:w="70"/>
-              <w:end w:type="dxa" w:w="70"/>
-            </w:tcMar>
-            <w:tcBorders>
               <w:top w:val="nil" w:sz="0" w:color="666666"/>
               <w:bottom w:val="nil" w:sz="0" w:color="666666"/>
               <w:start w:val="nil" w:sz="0" w:color="666666"/>
@@ -1295,264 +1009,13 @@
           <w:p>
             <w:pPr>
               <w:spacing w:before="0" w:after="60"/>
-              <w:jc w:val="start"/>
-            </w:pPr>
-            <w:r>
-              <w:rPr>
-                <w:rFonts w:ascii="Arial" w:hAnsi="Arial"/>
-                <w:sz w:val="20"/>
-              </w:rPr>
-              <w:t xml:space="default">Runtime (minutes/trial), median (IQR)</w:t>
-            </w:r>
-          </w:p>
-        </w:tc>
-        <w:tc>
-          <w:tcPr>
-            <w:tcW w:type="dxa" w:w="1587"/>
-            <w:tcMar>
-              <w:top w:type="dxa" w:w="35"/>
-              <w:bottom w:type="dxa" w:w="35"/>
-              <w:start w:type="dxa" w:w="70"/>
-              <w:end w:type="dxa" w:w="70"/>
-            </w:tcMar>
-            <w:tcBorders>
-              <w:top w:val="nil" w:sz="0" w:color="666666"/>
-              <w:bottom w:val="nil" w:sz="0" w:color="666666"/>
-              <w:start w:val="nil" w:sz="0" w:color="666666"/>
-              <w:end w:val="nil" w:sz="0" w:color="666666"/>
-            </w:tcBorders>
-          </w:tcPr>
-          <w:p>
-            <w:pPr>
-              <w:spacing w:before="0" w:after="60"/>
-              <w:jc w:val="end"/>
-            </w:pPr>
-            <w:r>
-              <w:rPr>
-                <w:rFonts w:ascii="Arial" w:hAnsi="Arial"/>
-                <w:sz w:val="20"/>
-              </w:rPr>
-              <w:t xml:space="default">7.6 (6.1–10.5)</w:t>
-            </w:r>
-          </w:p>
-        </w:tc>
-        <w:tc>
-          <w:tcPr>
-            <w:tcW w:type="dxa" w:w="2098"/>
-            <w:tcMar>
-              <w:top w:type="dxa" w:w="35"/>
-              <w:bottom w:type="dxa" w:w="35"/>
-              <w:start w:type="dxa" w:w="70"/>
-              <w:end w:type="dxa" w:w="70"/>
-            </w:tcMar>
-            <w:tcBorders>
-              <w:top w:val="nil" w:sz="0" w:color="666666"/>
-              <w:bottom w:val="nil" w:sz="0" w:color="666666"/>
-              <w:start w:val="nil" w:sz="0" w:color="666666"/>
-              <w:end w:val="nil" w:sz="0" w:color="666666"/>
-            </w:tcBorders>
-          </w:tcPr>
-          <w:p>
-            <w:pPr>
-              <w:spacing w:before="0" w:after="60"/>
-              <w:jc w:val="end"/>
-            </w:pPr>
-            <w:r>
-              <w:rPr>
-                <w:rFonts w:ascii="Arial" w:hAnsi="Arial"/>
-                <w:sz w:val="20"/>
-              </w:rPr>
-              <w:t xml:space="default">0.5 (0.4–0.5)</w:t>
-            </w:r>
-          </w:p>
-        </w:tc>
-        <w:tc>
-          <w:tcPr>
-            <w:tcW w:type="dxa" w:w="2362"/>
-            <w:tcMar>
-              <w:top w:type="dxa" w:w="35"/>
-              <w:bottom w:type="dxa" w:w="35"/>
-              <w:start w:type="dxa" w:w="70"/>
-              <w:end w:type="dxa" w:w="70"/>
-            </w:tcMar>
-            <w:tcBorders>
-              <w:top w:val="nil" w:sz="0" w:color="666666"/>
-              <w:bottom w:val="nil" w:sz="0" w:color="666666"/>
-              <w:start w:val="nil" w:sz="0" w:color="666666"/>
-              <w:end w:val="nil" w:sz="0" w:color="666666"/>
-            </w:tcBorders>
-          </w:tcPr>
-          <w:p>
-            <w:pPr>
-              <w:spacing w:before="0" w:after="60"/>
-              <w:jc w:val="end"/>
-            </w:pPr>
-            <w:r>
-              <w:rPr>
-                <w:rFonts w:ascii="Arial" w:hAnsi="Arial"/>
-                <w:sz w:val="20"/>
-              </w:rPr>
-              <w:t xml:space="default">11.0 (8.4–14.1)</w:t>
-            </w:r>
-          </w:p>
-        </w:tc>
-      </w:tr>
-      <w:tr>
-        <w:trPr>
-          <w:cantSplit/>
-        </w:trPr>
-        <w:tc>
-          <w:tcPr>
-            <w:tcW w:type="dxa" w:w="3817"/>
-            <w:tcMar>
-              <w:top w:type="dxa" w:w="35"/>
-              <w:bottom w:type="dxa" w:w="35"/>
-              <w:start w:type="dxa" w:w="70"/>
-              <w:end w:type="dxa" w:w="70"/>
-            </w:tcMar>
-            <w:tcBorders>
-              <w:top w:val="nil" w:sz="0" w:color="666666"/>
-              <w:bottom w:val="nil" w:sz="0" w:color="666666"/>
-              <w:start w:val="nil" w:sz="0" w:color="666666"/>
-              <w:end w:val="nil" w:sz="0" w:color="666666"/>
-            </w:tcBorders>
-          </w:tcPr>
-          <w:p>
-            <w:pPr>
-              <w:spacing w:before="0" w:after="60"/>
-              <w:jc w:val="start"/>
-            </w:pPr>
-            <w:r>
-              <w:rPr>
-                <w:rFonts w:ascii="Arial" w:hAnsi="Arial"/>
-                <w:sz w:val="20"/>
-              </w:rPr>
-              <w:t xml:space="default">API list-price equivalent (US$/trial), median (IQR)</w:t>
-            </w:r>
-          </w:p>
-        </w:tc>
-        <w:tc>
-          <w:tcPr>
-            <w:tcW w:type="dxa" w:w="1587"/>
-            <w:tcMar>
-              <w:top w:type="dxa" w:w="35"/>
-              <w:bottom w:type="dxa" w:w="35"/>
-              <w:start w:type="dxa" w:w="70"/>
-              <w:end w:type="dxa" w:w="70"/>
-            </w:tcMar>
-            <w:tcBorders>
-              <w:top w:val="nil" w:sz="0" w:color="666666"/>
-              <w:bottom w:val="nil" w:sz="0" w:color="666666"/>
-              <w:start w:val="nil" w:sz="0" w:color="666666"/>
-              <w:end w:val="nil" w:sz="0" w:color="666666"/>
-            </w:tcBorders>
-          </w:tcPr>
-          <w:p>
-            <w:pPr>
-              <w:spacing w:before="0" w:after="60"/>
-              <w:jc w:val="end"/>
-            </w:pPr>
-            <w:r>
-              <w:rPr>
-                <w:rFonts w:ascii="Arial" w:hAnsi="Arial"/>
-                <w:sz w:val="20"/>
-              </w:rPr>
-              <w:t xml:space="default">3.78 (3.46–4.10)</w:t>
-            </w:r>
-          </w:p>
-        </w:tc>
-        <w:tc>
-          <w:tcPr>
-            <w:tcW w:type="dxa" w:w="2098"/>
-            <w:tcMar>
-              <w:top w:type="dxa" w:w="35"/>
-              <w:bottom w:type="dxa" w:w="35"/>
-              <w:start w:type="dxa" w:w="70"/>
-              <w:end w:type="dxa" w:w="70"/>
-            </w:tcMar>
-            <w:tcBorders>
-              <w:top w:val="nil" w:sz="0" w:color="666666"/>
-              <w:bottom w:val="nil" w:sz="0" w:color="666666"/>
-              <w:start w:val="nil" w:sz="0" w:color="666666"/>
-              <w:end w:val="nil" w:sz="0" w:color="666666"/>
-            </w:tcBorders>
-          </w:tcPr>
-          <w:p>
-            <w:pPr>
-              <w:spacing w:before="0" w:after="60"/>
-              <w:jc w:val="end"/>
-            </w:pPr>
-            <w:r>
-              <w:rPr>
-                <w:rFonts w:ascii="Arial" w:hAnsi="Arial"/>
-                <w:sz w:val="20"/>
-              </w:rPr>
-              <w:t xml:space="default">0.09 (0.07–0.13)</w:t>
-            </w:r>
-          </w:p>
-        </w:tc>
-        <w:tc>
-          <w:tcPr>
-            <w:tcW w:type="dxa" w:w="2362"/>
-            <w:tcMar>
-              <w:top w:type="dxa" w:w="35"/>
-              <w:bottom w:type="dxa" w:w="35"/>
-              <w:start w:type="dxa" w:w="70"/>
-              <w:end w:type="dxa" w:w="70"/>
-            </w:tcMar>
-            <w:tcBorders>
-              <w:top w:val="nil" w:sz="0" w:color="666666"/>
-              <w:bottom w:val="nil" w:sz="0" w:color="666666"/>
-              <w:start w:val="nil" w:sz="0" w:color="666666"/>
-              <w:end w:val="nil" w:sz="0" w:color="666666"/>
-            </w:tcBorders>
-          </w:tcPr>
-          <w:p>
-            <w:pPr>
-              <w:spacing w:before="0" w:after="60"/>
-              <w:jc w:val="end"/>
-            </w:pPr>
-            <w:r>
-              <w:rPr>
-                <w:rFonts w:ascii="Arial" w:hAnsi="Arial"/>
-                <w:sz w:val="20"/>
-              </w:rPr>
-              <w:t xml:space="default">3.68 (3.61–3.75)</w:t>
-            </w:r>
-          </w:p>
-        </w:tc>
-      </w:tr>
-      <w:tr>
-        <w:trPr>
-          <w:cantSplit/>
-        </w:trPr>
-        <w:tc>
-          <w:tcPr>
-            <w:gridSpan w:val="4"/>
-            <w:tcW w:type="dxa" w:w="9864"/>
-            <w:tcMar>
-              <w:top w:type="dxa" w:w="35"/>
-              <w:bottom w:type="dxa" w:w="35"/>
-              <w:start w:type="dxa" w:w="70"/>
-              <w:end w:type="dxa" w:w="70"/>
-            </w:tcMar>
-            <w:tcBorders>
-              <w:top w:val="nil" w:sz="0" w:color="666666"/>
-              <w:bottom w:val="nil" w:sz="0" w:color="666666"/>
-              <w:start w:val="nil" w:sz="0" w:color="666666"/>
-              <w:end w:val="nil" w:sz="0" w:color="666666"/>
-            </w:tcBorders>
-          </w:tcPr>
-          <w:p>
-            <w:pPr>
-              <w:spacing w:before="0" w:after="60"/>
-            </w:pPr>
-            <w:r>
-              <w:rPr>
-                <w:rFonts w:ascii="Arial" w:hAnsi="Arial"/>
-                <w:sz w:val="20"/>
-              </w:rPr>
-              <w:t xml:space="default">Unassisted rule-break cells show No./total (%; 95% CI); CI bounds are percentages. Domain rules use evaluable ratings (ARBITER 510; Unassisted 509); one Unassisted cell is unevaluable. Evidence denominators count active answers or distinct evidence records as indicated; verifier denominator is 102 bundles. ARBITER has no recorded domain overrides; one Overall escalation is permitted. Evidence checks establish quotation occurrence and structural binding, without assessing answer support. Runtime and API list-price equivalents use 102 paired trials; source summaries are median (IQR), contrasts are paired mean differences. Cost is a frozen-rate equivalent, not expenditure. — means not applicable; Not available means not measured. CI, 95% confidence interval; 10,000 percentile bootstrap replicates, trials resampled within meta-analysis; seed 20261018.</w:t>
+            </w:pPr>
+            <w:r>
+              <w:rPr>
+                <w:rFonts w:ascii="Arial" w:hAnsi="Arial"/>
+                <w:sz w:val="20"/>
+              </w:rPr>
+              <w:t xml:space="default">Unassisted rule-break cells show No./total (%; 95% CI); CI bounds are percentages. Domain rules use evaluable ratings (ARBITER 510; Unassisted 509); one Unassisted cell is unevaluable. ARBITER has no recorded domain overrides; one Overall escalation is permitted. Runtime and API list-price equivalents use 102 paired trials; source summaries are median (IQR), contrasts are paired mean differences. Cost is a frozen-rate equivalent, not expenditure. — means not applicable; Not available means not measured. CI, 95% confidence interval; 10,000 percentile bootstrap replicates, trials resampled within meta-analysis; seed 20261018.</w:t>
             </w:r>
           </w:p>
         </w:tc>

</xml_diff>